<commit_message>
E6: fuera del documento del aviso la nota interna que no le toca a Legal
Era mantenimiento nuestro (la documentacion de la base todavia cita al chofer
como ejemplo del tipo otro) y se imprimia en el Word que va a Drive.
</commit_message>
<xml_diff>
--- a/Entregables/E6 - Cumplimiento Legal y Privacidad/E6 - Aviso de Privacidad SATAG.docx
+++ b/Entregables/E6 - Cumplimiento Legal y Privacidad/E6 - Aviso de Privacidad SATAG.docx
@@ -119,7 +119,7 @@
           <w:szCs w:val="20"/>
           <w:lang w:val="es-ES"/>
         </w:rPr>
-        <w:pict w14:anchorId="13DF34A4">
+        <w:pict w14:anchorId="5D559E76">
           <v:rect id="_x0000_i1025" style="width:0;height:1.5pt" o:hralign="center" o:hrstd="t" o:hr="t" fillcolor="#a0a0a0" stroked="f"/>
         </w:pict>
       </w:r>
@@ -275,7 +275,7 @@
           <w:szCs w:val="20"/>
           <w:lang w:val="es-ES"/>
         </w:rPr>
-        <w:pict w14:anchorId="74F337DD">
+        <w:pict w14:anchorId="38AD014A">
           <v:rect id="_x0000_i1026" style="width:0;height:1.5pt" o:hralign="center" o:hrstd="t" o:hr="t" fillcolor="#a0a0a0" stroked="f"/>
         </w:pict>
       </w:r>
@@ -2077,7 +2077,7 @@
           <w:szCs w:val="20"/>
           <w:lang w:val="es-ES"/>
         </w:rPr>
-        <w:pict w14:anchorId="31B313A5">
+        <w:pict w14:anchorId="6017475A">
           <v:rect id="_x0000_i1027" style="width:0;height:1.5pt" o:hralign="center" o:hrstd="t" o:hr="t" fillcolor="#a0a0a0" stroked="f"/>
         </w:pict>
       </w:r>
@@ -2193,9 +2193,9 @@
         <w:tblLook w:val="04A0" w:firstRow="1" w:lastRow="0" w:firstColumn="1" w:lastColumn="0" w:noHBand="0" w:noVBand="1"/>
       </w:tblPr>
       <w:tblGrid>
-        <w:gridCol w:w="3328"/>
-        <w:gridCol w:w="3329"/>
-        <w:gridCol w:w="3327"/>
+        <w:gridCol w:w="3762"/>
+        <w:gridCol w:w="2604"/>
+        <w:gridCol w:w="3618"/>
       </w:tblGrid>
       <w:tr>
         <w:trPr>
@@ -2204,7 +2204,7 @@
         </w:trPr>
         <w:tc>
           <w:tcPr>
-            <w:tcW w:w="1667" w:type="pct"/>
+            <w:tcW w:w="1884" w:type="pct"/>
             <w:tcBorders>
               <w:top w:val="single" w:sz="6" w:space="0" w:color="CFD6E0"/>
               <w:left w:val="single" w:sz="6" w:space="0" w:color="CFD6E0"/>
@@ -2247,7 +2247,7 @@
         </w:tc>
         <w:tc>
           <w:tcPr>
-            <w:tcW w:w="1667" w:type="pct"/>
+            <w:tcW w:w="1304" w:type="pct"/>
             <w:tcBorders>
               <w:top w:val="single" w:sz="6" w:space="0" w:color="CFD6E0"/>
               <w:left w:val="single" w:sz="6" w:space="0" w:color="CFD6E0"/>
@@ -2290,7 +2290,7 @@
         </w:tc>
         <w:tc>
           <w:tcPr>
-            <w:tcW w:w="1667" w:type="pct"/>
+            <w:tcW w:w="1812" w:type="pct"/>
             <w:tcBorders>
               <w:top w:val="single" w:sz="6" w:space="0" w:color="CFD6E0"/>
               <w:left w:val="single" w:sz="6" w:space="0" w:color="CFD6E0"/>
@@ -2338,7 +2338,7 @@
         </w:trPr>
         <w:tc>
           <w:tcPr>
-            <w:tcW w:w="1667" w:type="pct"/>
+            <w:tcW w:w="1884" w:type="pct"/>
             <w:tcBorders>
               <w:top w:val="single" w:sz="6" w:space="0" w:color="CFD6E0"/>
               <w:left w:val="single" w:sz="6" w:space="0" w:color="CFD6E0"/>
@@ -2385,7 +2385,7 @@
         </w:tc>
         <w:tc>
           <w:tcPr>
-            <w:tcW w:w="1667" w:type="pct"/>
+            <w:tcW w:w="1304" w:type="pct"/>
             <w:tcBorders>
               <w:top w:val="single" w:sz="6" w:space="0" w:color="CFD6E0"/>
               <w:left w:val="single" w:sz="6" w:space="0" w:color="CFD6E0"/>
@@ -2423,7 +2423,7 @@
         </w:tc>
         <w:tc>
           <w:tcPr>
-            <w:tcW w:w="1667" w:type="pct"/>
+            <w:tcW w:w="1812" w:type="pct"/>
             <w:tcBorders>
               <w:top w:val="single" w:sz="6" w:space="0" w:color="CFD6E0"/>
               <w:left w:val="single" w:sz="6" w:space="0" w:color="CFD6E0"/>
@@ -2494,7 +2494,7 @@
         </w:trPr>
         <w:tc>
           <w:tcPr>
-            <w:tcW w:w="1667" w:type="pct"/>
+            <w:tcW w:w="1884" w:type="pct"/>
             <w:tcBorders>
               <w:top w:val="single" w:sz="6" w:space="0" w:color="CFD6E0"/>
               <w:left w:val="single" w:sz="6" w:space="0" w:color="CFD6E0"/>
@@ -2541,7 +2541,7 @@
         </w:tc>
         <w:tc>
           <w:tcPr>
-            <w:tcW w:w="1667" w:type="pct"/>
+            <w:tcW w:w="1304" w:type="pct"/>
             <w:tcBorders>
               <w:top w:val="single" w:sz="6" w:space="0" w:color="CFD6E0"/>
               <w:left w:val="single" w:sz="6" w:space="0" w:color="CFD6E0"/>
@@ -2579,7 +2579,7 @@
         </w:tc>
         <w:tc>
           <w:tcPr>
-            <w:tcW w:w="1667" w:type="pct"/>
+            <w:tcW w:w="1812" w:type="pct"/>
             <w:tcBorders>
               <w:top w:val="single" w:sz="6" w:space="0" w:color="CFD6E0"/>
               <w:left w:val="single" w:sz="6" w:space="0" w:color="CFD6E0"/>
@@ -2668,7 +2668,7 @@
         </w:trPr>
         <w:tc>
           <w:tcPr>
-            <w:tcW w:w="1667" w:type="pct"/>
+            <w:tcW w:w="1884" w:type="pct"/>
             <w:tcBorders>
               <w:top w:val="single" w:sz="6" w:space="0" w:color="CFD6E0"/>
               <w:left w:val="single" w:sz="6" w:space="0" w:color="CFD6E0"/>
@@ -2724,7 +2724,7 @@
         </w:tc>
         <w:tc>
           <w:tcPr>
-            <w:tcW w:w="1667" w:type="pct"/>
+            <w:tcW w:w="1304" w:type="pct"/>
             <w:tcBorders>
               <w:top w:val="single" w:sz="6" w:space="0" w:color="CFD6E0"/>
               <w:left w:val="single" w:sz="6" w:space="0" w:color="CFD6E0"/>
@@ -2762,7 +2762,7 @@
         </w:tc>
         <w:tc>
           <w:tcPr>
-            <w:tcW w:w="1667" w:type="pct"/>
+            <w:tcW w:w="1812" w:type="pct"/>
             <w:tcBorders>
               <w:top w:val="single" w:sz="6" w:space="0" w:color="CFD6E0"/>
               <w:left w:val="single" w:sz="6" w:space="0" w:color="CFD6E0"/>
@@ -2833,7 +2833,7 @@
         </w:trPr>
         <w:tc>
           <w:tcPr>
-            <w:tcW w:w="1667" w:type="pct"/>
+            <w:tcW w:w="1884" w:type="pct"/>
             <w:tcBorders>
               <w:top w:val="single" w:sz="6" w:space="0" w:color="CFD6E0"/>
               <w:left w:val="single" w:sz="6" w:space="0" w:color="CFD6E0"/>
@@ -2889,7 +2889,7 @@
         </w:tc>
         <w:tc>
           <w:tcPr>
-            <w:tcW w:w="1667" w:type="pct"/>
+            <w:tcW w:w="1304" w:type="pct"/>
             <w:tcBorders>
               <w:top w:val="single" w:sz="6" w:space="0" w:color="CFD6E0"/>
               <w:left w:val="single" w:sz="6" w:space="0" w:color="CFD6E0"/>
@@ -2927,7 +2927,7 @@
         </w:tc>
         <w:tc>
           <w:tcPr>
-            <w:tcW w:w="1667" w:type="pct"/>
+            <w:tcW w:w="1812" w:type="pct"/>
             <w:tcBorders>
               <w:top w:val="single" w:sz="6" w:space="0" w:color="CFD6E0"/>
               <w:left w:val="single" w:sz="6" w:space="0" w:color="CFD6E0"/>
@@ -2979,7 +2979,7 @@
         </w:trPr>
         <w:tc>
           <w:tcPr>
-            <w:tcW w:w="1667" w:type="pct"/>
+            <w:tcW w:w="1884" w:type="pct"/>
             <w:tcBorders>
               <w:top w:val="single" w:sz="6" w:space="0" w:color="CFD6E0"/>
               <w:left w:val="single" w:sz="6" w:space="0" w:color="CFD6E0"/>
@@ -3035,7 +3035,7 @@
         </w:tc>
         <w:tc>
           <w:tcPr>
-            <w:tcW w:w="1667" w:type="pct"/>
+            <w:tcW w:w="1304" w:type="pct"/>
             <w:tcBorders>
               <w:top w:val="single" w:sz="6" w:space="0" w:color="CFD6E0"/>
               <w:left w:val="single" w:sz="6" w:space="0" w:color="CFD6E0"/>
@@ -3073,7 +3073,7 @@
         </w:tc>
         <w:tc>
           <w:tcPr>
-            <w:tcW w:w="1667" w:type="pct"/>
+            <w:tcW w:w="1812" w:type="pct"/>
             <w:tcBorders>
               <w:top w:val="single" w:sz="6" w:space="0" w:color="CFD6E0"/>
               <w:left w:val="single" w:sz="6" w:space="0" w:color="CFD6E0"/>
@@ -3125,7 +3125,7 @@
         </w:trPr>
         <w:tc>
           <w:tcPr>
-            <w:tcW w:w="1667" w:type="pct"/>
+            <w:tcW w:w="1884" w:type="pct"/>
             <w:tcBorders>
               <w:top w:val="single" w:sz="6" w:space="0" w:color="CFD6E0"/>
               <w:left w:val="single" w:sz="6" w:space="0" w:color="CFD6E0"/>
@@ -3157,6 +3157,7 @@
                 <w:sz w:val="17"/>
                 <w:szCs w:val="18"/>
               </w:rPr>
+              <w:lastRenderedPageBreak/>
               <w:t>El cobro del TAG.</w:t>
             </w:r>
             <w:r>
@@ -3181,7 +3182,7 @@
         </w:tc>
         <w:tc>
           <w:tcPr>
-            <w:tcW w:w="1667" w:type="pct"/>
+            <w:tcW w:w="1304" w:type="pct"/>
             <w:tcBorders>
               <w:top w:val="single" w:sz="6" w:space="0" w:color="CFD6E0"/>
               <w:left w:val="single" w:sz="6" w:space="0" w:color="CFD6E0"/>
@@ -3219,7 +3220,7 @@
         </w:tc>
         <w:tc>
           <w:tcPr>
-            <w:tcW w:w="1667" w:type="pct"/>
+            <w:tcW w:w="1812" w:type="pct"/>
             <w:tcBorders>
               <w:top w:val="single" w:sz="6" w:space="0" w:color="CFD6E0"/>
               <w:left w:val="single" w:sz="6" w:space="0" w:color="CFD6E0"/>
@@ -3271,7 +3272,7 @@
         </w:trPr>
         <w:tc>
           <w:tcPr>
-            <w:tcW w:w="1667" w:type="pct"/>
+            <w:tcW w:w="1884" w:type="pct"/>
             <w:tcBorders>
               <w:top w:val="single" w:sz="6" w:space="0" w:color="CFD6E0"/>
               <w:left w:val="single" w:sz="6" w:space="0" w:color="CFD6E0"/>
@@ -3346,7 +3347,7 @@
         </w:tc>
         <w:tc>
           <w:tcPr>
-            <w:tcW w:w="1667" w:type="pct"/>
+            <w:tcW w:w="1304" w:type="pct"/>
             <w:tcBorders>
               <w:top w:val="single" w:sz="6" w:space="0" w:color="CFD6E0"/>
               <w:left w:val="single" w:sz="6" w:space="0" w:color="CFD6E0"/>
@@ -3384,7 +3385,7 @@
         </w:tc>
         <w:tc>
           <w:tcPr>
-            <w:tcW w:w="1667" w:type="pct"/>
+            <w:tcW w:w="1812" w:type="pct"/>
             <w:tcBorders>
               <w:top w:val="single" w:sz="6" w:space="0" w:color="CFD6E0"/>
               <w:left w:val="single" w:sz="6" w:space="0" w:color="CFD6E0"/>
@@ -3455,7 +3456,7 @@
         </w:trPr>
         <w:tc>
           <w:tcPr>
-            <w:tcW w:w="1667" w:type="pct"/>
+            <w:tcW w:w="1884" w:type="pct"/>
             <w:tcBorders>
               <w:top w:val="single" w:sz="6" w:space="0" w:color="CFD6E0"/>
               <w:left w:val="single" w:sz="6" w:space="0" w:color="CFD6E0"/>
@@ -3502,7 +3503,7 @@
         </w:tc>
         <w:tc>
           <w:tcPr>
-            <w:tcW w:w="1667" w:type="pct"/>
+            <w:tcW w:w="1304" w:type="pct"/>
             <w:tcBorders>
               <w:top w:val="single" w:sz="6" w:space="0" w:color="CFD6E0"/>
               <w:left w:val="single" w:sz="6" w:space="0" w:color="CFD6E0"/>
@@ -3540,7 +3541,7 @@
         </w:tc>
         <w:tc>
           <w:tcPr>
-            <w:tcW w:w="1667" w:type="pct"/>
+            <w:tcW w:w="1812" w:type="pct"/>
             <w:tcBorders>
               <w:top w:val="single" w:sz="6" w:space="0" w:color="CFD6E0"/>
               <w:left w:val="single" w:sz="6" w:space="0" w:color="CFD6E0"/>
@@ -3620,7 +3621,7 @@
         </w:trPr>
         <w:tc>
           <w:tcPr>
-            <w:tcW w:w="1667" w:type="pct"/>
+            <w:tcW w:w="1884" w:type="pct"/>
             <w:tcBorders>
               <w:top w:val="single" w:sz="6" w:space="0" w:color="CFD6E0"/>
               <w:left w:val="single" w:sz="6" w:space="0" w:color="CFD6E0"/>
@@ -3667,7 +3668,7 @@
         </w:tc>
         <w:tc>
           <w:tcPr>
-            <w:tcW w:w="1667" w:type="pct"/>
+            <w:tcW w:w="1304" w:type="pct"/>
             <w:tcBorders>
               <w:top w:val="single" w:sz="6" w:space="0" w:color="CFD6E0"/>
               <w:left w:val="single" w:sz="6" w:space="0" w:color="CFD6E0"/>
@@ -3705,7 +3706,7 @@
         </w:tc>
         <w:tc>
           <w:tcPr>
-            <w:tcW w:w="1667" w:type="pct"/>
+            <w:tcW w:w="1812" w:type="pct"/>
             <w:tcBorders>
               <w:top w:val="single" w:sz="6" w:space="0" w:color="CFD6E0"/>
               <w:left w:val="single" w:sz="6" w:space="0" w:color="CFD6E0"/>
@@ -3757,7 +3758,7 @@
         </w:trPr>
         <w:tc>
           <w:tcPr>
-            <w:tcW w:w="1667" w:type="pct"/>
+            <w:tcW w:w="1884" w:type="pct"/>
             <w:tcBorders>
               <w:top w:val="single" w:sz="6" w:space="0" w:color="CFD6E0"/>
               <w:left w:val="single" w:sz="6" w:space="0" w:color="CFD6E0"/>
@@ -3823,7 +3824,7 @@
         </w:tc>
         <w:tc>
           <w:tcPr>
-            <w:tcW w:w="1667" w:type="pct"/>
+            <w:tcW w:w="1304" w:type="pct"/>
             <w:tcBorders>
               <w:top w:val="single" w:sz="6" w:space="0" w:color="CFD6E0"/>
               <w:left w:val="single" w:sz="6" w:space="0" w:color="CFD6E0"/>
@@ -3861,7 +3862,7 @@
         </w:tc>
         <w:tc>
           <w:tcPr>
-            <w:tcW w:w="1667" w:type="pct"/>
+            <w:tcW w:w="1812" w:type="pct"/>
             <w:tcBorders>
               <w:top w:val="single" w:sz="6" w:space="0" w:color="CFD6E0"/>
               <w:left w:val="single" w:sz="6" w:space="0" w:color="CFD6E0"/>
@@ -3922,7 +3923,7 @@
         </w:trPr>
         <w:tc>
           <w:tcPr>
-            <w:tcW w:w="1667" w:type="pct"/>
+            <w:tcW w:w="1884" w:type="pct"/>
             <w:tcBorders>
               <w:top w:val="single" w:sz="6" w:space="0" w:color="CFD6E0"/>
               <w:left w:val="single" w:sz="6" w:space="0" w:color="CFD6E0"/>
@@ -3954,6 +3955,7 @@
                 <w:sz w:val="17"/>
                 <w:szCs w:val="18"/>
               </w:rPr>
+              <w:lastRenderedPageBreak/>
               <w:t>Limitación del uso y revocación en este trámite.</w:t>
             </w:r>
             <w:r>
@@ -3969,7 +3971,7 @@
         </w:tc>
         <w:tc>
           <w:tcPr>
-            <w:tcW w:w="1667" w:type="pct"/>
+            <w:tcW w:w="1304" w:type="pct"/>
             <w:tcBorders>
               <w:top w:val="single" w:sz="6" w:space="0" w:color="CFD6E0"/>
               <w:left w:val="single" w:sz="6" w:space="0" w:color="CFD6E0"/>
@@ -4007,7 +4009,7 @@
         </w:tc>
         <w:tc>
           <w:tcPr>
-            <w:tcW w:w="1667" w:type="pct"/>
+            <w:tcW w:w="1812" w:type="pct"/>
             <w:tcBorders>
               <w:top w:val="single" w:sz="6" w:space="0" w:color="CFD6E0"/>
               <w:left w:val="single" w:sz="6" w:space="0" w:color="CFD6E0"/>
@@ -4068,7 +4070,7 @@
         </w:trPr>
         <w:tc>
           <w:tcPr>
-            <w:tcW w:w="1667" w:type="pct"/>
+            <w:tcW w:w="1884" w:type="pct"/>
             <w:tcBorders>
               <w:top w:val="single" w:sz="6" w:space="0" w:color="CFD6E0"/>
               <w:left w:val="single" w:sz="6" w:space="0" w:color="CFD6E0"/>
@@ -4115,7 +4117,7 @@
         </w:tc>
         <w:tc>
           <w:tcPr>
-            <w:tcW w:w="1667" w:type="pct"/>
+            <w:tcW w:w="1304" w:type="pct"/>
             <w:tcBorders>
               <w:top w:val="single" w:sz="6" w:space="0" w:color="CFD6E0"/>
               <w:left w:val="single" w:sz="6" w:space="0" w:color="CFD6E0"/>
@@ -4153,7 +4155,7 @@
         </w:tc>
         <w:tc>
           <w:tcPr>
-            <w:tcW w:w="1667" w:type="pct"/>
+            <w:tcW w:w="1812" w:type="pct"/>
             <w:tcBorders>
               <w:top w:val="single" w:sz="6" w:space="0" w:color="CFD6E0"/>
               <w:left w:val="single" w:sz="6" w:space="0" w:color="CFD6E0"/>
@@ -4228,7 +4230,7 @@
           <w:szCs w:val="20"/>
           <w:lang w:val="es-ES"/>
         </w:rPr>
-        <w:pict w14:anchorId="3E056C3F">
+        <w:pict w14:anchorId="78192EDE">
           <v:rect id="_x0000_i1028" style="width:0;height:1.5pt" o:hralign="center" o:hrstd="t" o:hr="t" fillcolor="#a0a0a0" stroked="f"/>
         </w:pict>
       </w:r>
@@ -4303,9 +4305,9 @@
         <w:tblLook w:val="04A0" w:firstRow="1" w:lastRow="0" w:firstColumn="1" w:lastColumn="0" w:noHBand="0" w:noVBand="1"/>
       </w:tblPr>
       <w:tblGrid>
-        <w:gridCol w:w="3267"/>
-        <w:gridCol w:w="3452"/>
-        <w:gridCol w:w="3265"/>
+        <w:gridCol w:w="1755"/>
+        <w:gridCol w:w="5258"/>
+        <w:gridCol w:w="2971"/>
       </w:tblGrid>
       <w:tr>
         <w:trPr>
@@ -4314,7 +4316,7 @@
         </w:trPr>
         <w:tc>
           <w:tcPr>
-            <w:tcW w:w="1667" w:type="pct"/>
+            <w:tcW w:w="879" w:type="pct"/>
             <w:tcBorders>
               <w:top w:val="single" w:sz="6" w:space="0" w:color="CFD6E0"/>
               <w:left w:val="single" w:sz="6" w:space="0" w:color="CFD6E0"/>
@@ -4357,7 +4359,7 @@
         </w:tc>
         <w:tc>
           <w:tcPr>
-            <w:tcW w:w="1667" w:type="pct"/>
+            <w:tcW w:w="2633" w:type="pct"/>
             <w:tcBorders>
               <w:top w:val="single" w:sz="6" w:space="0" w:color="CFD6E0"/>
               <w:left w:val="single" w:sz="6" w:space="0" w:color="CFD6E0"/>
@@ -4400,7 +4402,7 @@
         </w:tc>
         <w:tc>
           <w:tcPr>
-            <w:tcW w:w="1667" w:type="pct"/>
+            <w:tcW w:w="1488" w:type="pct"/>
             <w:tcBorders>
               <w:top w:val="single" w:sz="6" w:space="0" w:color="CFD6E0"/>
               <w:left w:val="single" w:sz="6" w:space="0" w:color="CFD6E0"/>
@@ -4448,7 +4450,7 @@
         </w:trPr>
         <w:tc>
           <w:tcPr>
-            <w:tcW w:w="1667" w:type="pct"/>
+            <w:tcW w:w="879" w:type="pct"/>
             <w:tcBorders>
               <w:top w:val="single" w:sz="6" w:space="0" w:color="CFD6E0"/>
               <w:left w:val="single" w:sz="6" w:space="0" w:color="CFD6E0"/>
@@ -4486,7 +4488,7 @@
         </w:tc>
         <w:tc>
           <w:tcPr>
-            <w:tcW w:w="1667" w:type="pct"/>
+            <w:tcW w:w="2633" w:type="pct"/>
             <w:tcBorders>
               <w:top w:val="single" w:sz="6" w:space="0" w:color="CFD6E0"/>
               <w:left w:val="single" w:sz="6" w:space="0" w:color="CFD6E0"/>
@@ -4524,7 +4526,7 @@
         </w:tc>
         <w:tc>
           <w:tcPr>
-            <w:tcW w:w="1667" w:type="pct"/>
+            <w:tcW w:w="1488" w:type="pct"/>
             <w:tcBorders>
               <w:top w:val="single" w:sz="6" w:space="0" w:color="CFD6E0"/>
               <w:left w:val="single" w:sz="6" w:space="0" w:color="CFD6E0"/>
@@ -4567,7 +4569,7 @@
         </w:trPr>
         <w:tc>
           <w:tcPr>
-            <w:tcW w:w="1667" w:type="pct"/>
+            <w:tcW w:w="879" w:type="pct"/>
             <w:tcBorders>
               <w:top w:val="single" w:sz="6" w:space="0" w:color="CFD6E0"/>
               <w:left w:val="single" w:sz="6" w:space="0" w:color="CFD6E0"/>
@@ -4605,7 +4607,7 @@
         </w:tc>
         <w:tc>
           <w:tcPr>
-            <w:tcW w:w="1667" w:type="pct"/>
+            <w:tcW w:w="2633" w:type="pct"/>
             <w:tcBorders>
               <w:top w:val="single" w:sz="6" w:space="0" w:color="CFD6E0"/>
               <w:left w:val="single" w:sz="6" w:space="0" w:color="CFD6E0"/>
@@ -4642,7 +4644,7 @@
         </w:tc>
         <w:tc>
           <w:tcPr>
-            <w:tcW w:w="1667" w:type="pct"/>
+            <w:tcW w:w="1488" w:type="pct"/>
             <w:tcBorders>
               <w:top w:val="single" w:sz="6" w:space="0" w:color="CFD6E0"/>
               <w:left w:val="single" w:sz="6" w:space="0" w:color="CFD6E0"/>
@@ -4685,7 +4687,7 @@
         </w:trPr>
         <w:tc>
           <w:tcPr>
-            <w:tcW w:w="1667" w:type="pct"/>
+            <w:tcW w:w="879" w:type="pct"/>
             <w:tcBorders>
               <w:top w:val="single" w:sz="6" w:space="0" w:color="CFD6E0"/>
               <w:left w:val="single" w:sz="6" w:space="0" w:color="CFD6E0"/>
@@ -4723,7 +4725,7 @@
         </w:tc>
         <w:tc>
           <w:tcPr>
-            <w:tcW w:w="1667" w:type="pct"/>
+            <w:tcW w:w="2633" w:type="pct"/>
             <w:tcBorders>
               <w:top w:val="single" w:sz="6" w:space="0" w:color="CFD6E0"/>
               <w:left w:val="single" w:sz="6" w:space="0" w:color="CFD6E0"/>
@@ -4761,7 +4763,7 @@
         </w:tc>
         <w:tc>
           <w:tcPr>
-            <w:tcW w:w="1667" w:type="pct"/>
+            <w:tcW w:w="1488" w:type="pct"/>
             <w:tcBorders>
               <w:top w:val="single" w:sz="6" w:space="0" w:color="CFD6E0"/>
               <w:left w:val="single" w:sz="6" w:space="0" w:color="CFD6E0"/>
@@ -4822,7 +4824,7 @@
         </w:trPr>
         <w:tc>
           <w:tcPr>
-            <w:tcW w:w="1667" w:type="pct"/>
+            <w:tcW w:w="879" w:type="pct"/>
             <w:tcBorders>
               <w:top w:val="single" w:sz="6" w:space="0" w:color="CFD6E0"/>
               <w:left w:val="single" w:sz="6" w:space="0" w:color="CFD6E0"/>
@@ -4860,7 +4862,7 @@
         </w:tc>
         <w:tc>
           <w:tcPr>
-            <w:tcW w:w="1667" w:type="pct"/>
+            <w:tcW w:w="2633" w:type="pct"/>
             <w:tcBorders>
               <w:top w:val="single" w:sz="6" w:space="0" w:color="CFD6E0"/>
               <w:left w:val="single" w:sz="6" w:space="0" w:color="CFD6E0"/>
@@ -4898,7 +4900,7 @@
         </w:tc>
         <w:tc>
           <w:tcPr>
-            <w:tcW w:w="1667" w:type="pct"/>
+            <w:tcW w:w="1488" w:type="pct"/>
             <w:tcBorders>
               <w:top w:val="single" w:sz="6" w:space="0" w:color="CFD6E0"/>
               <w:left w:val="single" w:sz="6" w:space="0" w:color="CFD6E0"/>
@@ -4959,7 +4961,7 @@
         </w:trPr>
         <w:tc>
           <w:tcPr>
-            <w:tcW w:w="1667" w:type="pct"/>
+            <w:tcW w:w="879" w:type="pct"/>
             <w:tcBorders>
               <w:top w:val="single" w:sz="6" w:space="0" w:color="CFD6E0"/>
               <w:left w:val="single" w:sz="6" w:space="0" w:color="CFD6E0"/>
@@ -4991,13 +4993,14 @@
                 <w:sz w:val="17"/>
                 <w:szCs w:val="18"/>
               </w:rPr>
+              <w:lastRenderedPageBreak/>
               <w:t>Derechos ARCO y sus plazos</w:t>
             </w:r>
           </w:p>
         </w:tc>
         <w:tc>
           <w:tcPr>
-            <w:tcW w:w="1667" w:type="pct"/>
+            <w:tcW w:w="2633" w:type="pct"/>
             <w:tcBorders>
               <w:top w:val="single" w:sz="6" w:space="0" w:color="CFD6E0"/>
               <w:left w:val="single" w:sz="6" w:space="0" w:color="CFD6E0"/>
@@ -5035,7 +5038,7 @@
         </w:tc>
         <w:tc>
           <w:tcPr>
-            <w:tcW w:w="1667" w:type="pct"/>
+            <w:tcW w:w="1488" w:type="pct"/>
             <w:tcBorders>
               <w:top w:val="single" w:sz="6" w:space="0" w:color="CFD6E0"/>
               <w:left w:val="single" w:sz="6" w:space="0" w:color="CFD6E0"/>
@@ -5096,7 +5099,7 @@
         </w:trPr>
         <w:tc>
           <w:tcPr>
-            <w:tcW w:w="1667" w:type="pct"/>
+            <w:tcW w:w="879" w:type="pct"/>
             <w:tcBorders>
               <w:top w:val="single" w:sz="6" w:space="0" w:color="CFD6E0"/>
               <w:left w:val="single" w:sz="6" w:space="0" w:color="CFD6E0"/>
@@ -5134,7 +5137,7 @@
         </w:tc>
         <w:tc>
           <w:tcPr>
-            <w:tcW w:w="1667" w:type="pct"/>
+            <w:tcW w:w="2633" w:type="pct"/>
             <w:tcBorders>
               <w:top w:val="single" w:sz="6" w:space="0" w:color="CFD6E0"/>
               <w:left w:val="single" w:sz="6" w:space="0" w:color="CFD6E0"/>
@@ -5172,7 +5175,7 @@
         </w:tc>
         <w:tc>
           <w:tcPr>
-            <w:tcW w:w="1667" w:type="pct"/>
+            <w:tcW w:w="1488" w:type="pct"/>
             <w:tcBorders>
               <w:top w:val="single" w:sz="6" w:space="0" w:color="CFD6E0"/>
               <w:left w:val="single" w:sz="6" w:space="0" w:color="CFD6E0"/>
@@ -5215,7 +5218,7 @@
         </w:trPr>
         <w:tc>
           <w:tcPr>
-            <w:tcW w:w="1667" w:type="pct"/>
+            <w:tcW w:w="879" w:type="pct"/>
             <w:tcBorders>
               <w:top w:val="single" w:sz="6" w:space="0" w:color="CFD6E0"/>
               <w:left w:val="single" w:sz="6" w:space="0" w:color="CFD6E0"/>
@@ -5253,7 +5256,7 @@
         </w:tc>
         <w:tc>
           <w:tcPr>
-            <w:tcW w:w="1667" w:type="pct"/>
+            <w:tcW w:w="2633" w:type="pct"/>
             <w:tcBorders>
               <w:top w:val="single" w:sz="6" w:space="0" w:color="CFD6E0"/>
               <w:left w:val="single" w:sz="6" w:space="0" w:color="CFD6E0"/>
@@ -5309,7 +5312,7 @@
         </w:tc>
         <w:tc>
           <w:tcPr>
-            <w:tcW w:w="1667" w:type="pct"/>
+            <w:tcW w:w="1488" w:type="pct"/>
             <w:tcBorders>
               <w:top w:val="single" w:sz="6" w:space="0" w:color="CFD6E0"/>
               <w:left w:val="single" w:sz="6" w:space="0" w:color="CFD6E0"/>
@@ -5384,7 +5387,7 @@
           <w:szCs w:val="20"/>
           <w:lang w:val="es-ES"/>
         </w:rPr>
-        <w:pict w14:anchorId="7116756A">
+        <w:pict w14:anchorId="7927FF6B">
           <v:rect id="_x0000_i1029" style="width:0;height:1.5pt" o:hralign="center" o:hrstd="t" o:hr="t" fillcolor="#a0a0a0" stroked="f"/>
         </w:pict>
       </w:r>
@@ -5557,7 +5560,7 @@
           <w:szCs w:val="20"/>
           <w:lang w:val="es-ES"/>
         </w:rPr>
-        <w:pict w14:anchorId="05A35D1F">
+        <w:pict w14:anchorId="0E7EA6FB">
           <v:rect id="_x0000_i1030" style="width:0;height:1.5pt" o:hralign="center" o:hrstd="t" o:hr="t" fillcolor="#a0a0a0" stroked="f"/>
         </w:pict>
       </w:r>
@@ -5657,6 +5660,7 @@
           <w:szCs w:val="20"/>
           <w:lang w:val="es-ES"/>
         </w:rPr>
+        <w:lastRenderedPageBreak/>
         <w:t>DATOS PERSONALES QUE SE RECABAN ADICIONALMENTE PARA EL TAG VEHICULAR</w:t>
       </w:r>
     </w:p>
@@ -6242,7 +6246,19 @@
           <w:highlight w:val="yellow"/>
           <w:lang w:val="es-ES"/>
         </w:rPr>
-        <w:t xml:space="preserve">e y al vehículo asociado al dispositivo; asignar el lugar de estacionamiento y operar el control de acceso vehicular del inmueble; registrar la aceptación del reglamento del estacionamiento y conservar la evidencia de esa aceptación; registrar el cobro administrativo del TAG y conciliarlo con el efectivo recibido; gestionar la instalación, el cambio, la reposición, la baja o la inactivación del dispositivo; atender las solicitudes y aclaraciones que usted presente sobre el TAG o sobre sus datos personales; </w:t>
+        <w:t xml:space="preserve">e y al vehículo asociado al dispositivo; asignar el lugar de </w:t>
+      </w:r>
+      <w:r>
+        <w:rPr>
+          <w:rFonts w:ascii="Segoe UI" w:hAnsi="Segoe UI" w:cs="Segoe UI"/>
+          <w:color w:val="1C2333"/>
+          <w:sz w:val="20"/>
+          <w:szCs w:val="20"/>
+          <w:highlight w:val="yellow"/>
+          <w:lang w:val="es-ES"/>
+        </w:rPr>
+        <w:lastRenderedPageBreak/>
+        <w:t xml:space="preserve">estacionamiento y operar el control de acceso vehicular del inmueble; registrar la aceptación del reglamento del estacionamiento y conservar la evidencia de esa aceptación; registrar el cobro administrativo del TAG y conciliarlo con el efectivo recibido; gestionar la instalación, el cambio, la reposición, la baja o la inactivación del dispositivo; atender las solicitudes y aclaraciones que usted presente sobre el TAG o sobre sus datos personales; </w:t>
       </w:r>
       <w:r>
         <w:rPr>
@@ -7286,7 +7302,7 @@
           <w:szCs w:val="20"/>
           <w:lang w:val="es-ES"/>
         </w:rPr>
-        <w:pict w14:anchorId="67381A3E">
+        <w:pict w14:anchorId="2BD8AF72">
           <v:rect id="_x0000_i1031" style="width:0;height:1.5pt" o:hralign="center" o:hrstd="t" o:hr="t" fillcolor="#a0a0a0" stroked="f"/>
         </w:pict>
       </w:r>
@@ -7348,7 +7364,7 @@
           <w:szCs w:val="20"/>
           <w:lang w:val="es-ES"/>
         </w:rPr>
-        <w:pict w14:anchorId="6E53AE43">
+        <w:pict w14:anchorId="32CF6E19">
           <v:rect id="_x0000_i1032" style="width:0;height:1.5pt" o:hralign="center" o:hrstd="t" o:hr="t" fillcolor="#a0a0a0" stroked="f"/>
         </w:pict>
       </w:r>
@@ -7533,7 +7549,7 @@
           <w:szCs w:val="20"/>
           <w:lang w:val="es-ES"/>
         </w:rPr>
-        <w:pict w14:anchorId="1B513634">
+        <w:pict w14:anchorId="5ABF8C13">
           <v:rect id="_x0000_i1033" style="width:0;height:1.5pt" o:hralign="center" o:hrstd="t" o:hr="t" fillcolor="#a0a0a0" stroked="f"/>
         </w:pict>
       </w:r>
@@ -8104,64 +8120,8 @@
           <w:szCs w:val="20"/>
           <w:lang w:val="es-ES"/>
         </w:rPr>
-        <w:pict w14:anchorId="15993818">
+        <w:pict w14:anchorId="016D8A53">
           <v:rect id="_x0000_i1034" style="width:0;height:1.5pt" o:hralign="center" o:hrstd="t" o:hr="t" fillcolor="#a0a0a0" stroked="f"/>
-        </w:pict>
-      </w:r>
-    </w:p>
-    <w:p>
-      <w:pPr>
-        <w:pStyle w:val="NormalWeb"/>
-        <w:rPr>
-          <w:rFonts w:ascii="Segoe UI" w:hAnsi="Segoe UI" w:cs="Segoe UI"/>
-          <w:color w:val="1C2333"/>
-          <w:sz w:val="20"/>
-          <w:szCs w:val="20"/>
-          <w:lang w:val="es-ES"/>
-        </w:rPr>
-      </w:pPr>
-      <w:r>
-        <w:rPr>
-          <w:rStyle w:val="Fuerte"/>
-          <w:rFonts w:ascii="Segoe UI" w:hAnsi="Segoe UI" w:cs="Segoe UI"/>
-          <w:sz w:val="20"/>
-          <w:szCs w:val="20"/>
-          <w:lang w:val="es-ES"/>
-        </w:rPr>
-        <w:t>Nota interna, no requiere decisión de Legal.</w:t>
-      </w:r>
-      <w:r>
-        <w:rPr>
-          <w:rFonts w:ascii="Segoe UI" w:hAnsi="Segoe UI" w:cs="Segoe UI"/>
-          <w:color w:val="1C2333"/>
-          <w:sz w:val="20"/>
-          <w:szCs w:val="20"/>
-          <w:lang w:val="es-ES"/>
-        </w:rPr>
-        <w:t xml:space="preserve"> La documentación técnica de la base de datos todavía cita al "chofer de la familia" como ejemplo del tipo de usuario "otro", cuando la decisión vigente reserva ese tipo a los familiares. No es texto publicado ni lo ve la familia; queda anotado como tarea de mantenimiento del área de Sistemas para que nadie lo lea después como criterio vigente.</w:t>
-      </w:r>
-    </w:p>
-    <w:p>
-      <w:pPr>
-        <w:spacing w:before="210" w:after="210"/>
-        <w:rPr>
-          <w:rFonts w:ascii="Segoe UI" w:eastAsia="Times New Roman" w:hAnsi="Segoe UI" w:cs="Segoe UI"/>
-          <w:color w:val="1C2333"/>
-          <w:sz w:val="20"/>
-          <w:szCs w:val="20"/>
-          <w:lang w:val="es-ES"/>
-        </w:rPr>
-      </w:pPr>
-      <w:r>
-        <w:rPr>
-          <w:rFonts w:ascii="Segoe UI" w:eastAsia="Times New Roman" w:hAnsi="Segoe UI" w:cs="Segoe UI"/>
-          <w:color w:val="1C2333"/>
-          <w:sz w:val="20"/>
-          <w:szCs w:val="20"/>
-          <w:lang w:val="es-ES"/>
-        </w:rPr>
-        <w:pict w14:anchorId="3209A3F9">
-          <v:rect id="_x0000_i1035" style="width:0;height:1.5pt" o:hralign="center" o:hrstd="t" o:hr="t" fillcolor="#a0a0a0" stroked="f"/>
         </w:pict>
       </w:r>
     </w:p>
@@ -8230,9 +8190,9 @@
 <file path=word/numbering.xml><?xml version="1.0" encoding="utf-8"?>
 <w:numbering xmlns:wpc="http://schemas.microsoft.com/office/word/2010/wordprocessingCanvas" xmlns:cx="http://schemas.microsoft.com/office/drawing/2014/chartex" xmlns:cx1="http://schemas.microsoft.com/office/drawing/2015/9/8/chartex" xmlns:cx2="http://schemas.microsoft.com/office/drawing/2015/10/21/chartex" xmlns:cx3="http://schemas.microsoft.com/office/drawing/2016/5/9/chartex" xmlns:cx4="http://schemas.microsoft.com/office/drawing/2016/5/10/chartex" xmlns:cx5="http://schemas.microsoft.com/office/drawing/2016/5/11/chartex" xmlns:cx6="http://schemas.microsoft.com/office/drawing/2016/5/12/chartex" xmlns:cx7="http://schemas.microsoft.com/office/drawing/2016/5/13/chartex" xmlns:cx8="http://schemas.microsoft.com/office/drawing/2016/5/14/chartex" xmlns:mc="http://schemas.openxmlformats.org/markup-compatibility/2006" xmlns:aink="http://schemas.microsoft.com/office/drawing/2016/ink" xmlns:am3d="http://schemas.microsoft.com/office/drawing/2017/model3d" xmlns:o="urn:schemas-microsoft-com:office:office" xmlns:oel="http://schemas.microsoft.com/office/2019/extlst" xmlns:r="http://schemas.openxmlformats.org/officeDocument/2006/relationships" xmlns:m="http://schemas.openxmlformats.org/officeDocument/2006/math" xmlns:v="urn:schemas-microsoft-com:vml" xmlns:wp14="http://schemas.microsoft.com/office/word/2010/wordprocessingDrawing" xmlns:wp="http://schemas.openxmlformats.org/drawingml/2006/wordprocessingDrawing" xmlns:w10="urn:schemas-microsoft-com:office:word" xmlns:w="http://schemas.openxmlformats.org/wordprocessingml/2006/main" xmlns:w14="http://schemas.microsoft.com/office/word/2010/wordml" xmlns:w15="http://schemas.microsoft.com/office/word/2012/wordml" xmlns:w16cex="http://schemas.microsoft.com/office/word/2018/wordml/cex" xmlns:w16cid="http://schemas.microsoft.com/office/word/2016/wordml/cid" xmlns:w16="http://schemas.microsoft.com/office/word/2018/wordml" xmlns:w16du="http://schemas.microsoft.com/office/word/2023/wordml/word16du" xmlns:w16sdtdh="http://schemas.microsoft.com/office/word/2020/wordml/sdtdatahash" xmlns:w16sdtfl="http://schemas.microsoft.com/office/word/2024/wordml/sdtformatlock" xmlns:w16se="http://schemas.microsoft.com/office/word/2015/wordml/symex" xmlns:wpg="http://schemas.microsoft.com/office/word/2010/wordprocessingGroup" xmlns:wpi="http://schemas.microsoft.com/office/word/2010/wordprocessingInk" xmlns:wne="http://schemas.microsoft.com/office/word/2006/wordml" xmlns:wps="http://schemas.microsoft.com/office/word/2010/wordprocessingShape" mc:Ignorable="w14 w15 w16se w16cid w16 w16cex w16sdtdh w16sdtfl w16du wp14">
   <w:abstractNum w:abstractNumId="0" w15:restartNumberingAfterBreak="0">
-    <w:nsid w:val="0D14618A"/>
+    <w:nsid w:val="0538739B"/>
     <w:multiLevelType w:val="multilevel"/>
-    <w:tmpl w:val="6E3AFEBA"/>
+    <w:tmpl w:val="A8241EA8"/>
     <w:lvl w:ilvl="0">
       <w:start w:val="1"/>
       <w:numFmt w:val="decimal"/>
@@ -8343,9 +8303,9 @@
     </w:lvl>
   </w:abstractNum>
   <w:abstractNum w:abstractNumId="1" w15:restartNumberingAfterBreak="0">
-    <w:nsid w:val="1D9B055E"/>
+    <w:nsid w:val="11E47A27"/>
     <w:multiLevelType w:val="multilevel"/>
-    <w:tmpl w:val="F3D26B92"/>
+    <w:tmpl w:val="19E83C0A"/>
     <w:lvl w:ilvl="0">
       <w:start w:val="1"/>
       <w:numFmt w:val="decimal"/>
@@ -8456,9 +8416,9 @@
     </w:lvl>
   </w:abstractNum>
   <w:abstractNum w:abstractNumId="2" w15:restartNumberingAfterBreak="0">
-    <w:nsid w:val="4E2B1D68"/>
+    <w:nsid w:val="50C54EC9"/>
     <w:multiLevelType w:val="multilevel"/>
-    <w:tmpl w:val="AE160382"/>
+    <w:tmpl w:val="940ADD6C"/>
     <w:lvl w:ilvl="0">
       <w:start w:val="1"/>
       <w:numFmt w:val="decimal"/>
@@ -8569,9 +8529,9 @@
     </w:lvl>
   </w:abstractNum>
   <w:abstractNum w:abstractNumId="3" w15:restartNumberingAfterBreak="0">
-    <w:nsid w:val="4EFA1CA3"/>
+    <w:nsid w:val="57B86D8A"/>
     <w:multiLevelType w:val="multilevel"/>
-    <w:tmpl w:val="B80650B6"/>
+    <w:tmpl w:val="22A2018C"/>
     <w:lvl w:ilvl="0">
       <w:start w:val="1"/>
       <w:numFmt w:val="decimal"/>
@@ -8682,9 +8642,9 @@
     </w:lvl>
   </w:abstractNum>
   <w:abstractNum w:abstractNumId="4" w15:restartNumberingAfterBreak="0">
-    <w:nsid w:val="56DB59AB"/>
+    <w:nsid w:val="60D923D7"/>
     <w:multiLevelType w:val="multilevel"/>
-    <w:tmpl w:val="7702E216"/>
+    <w:tmpl w:val="39886868"/>
     <w:lvl w:ilvl="0">
       <w:start w:val="1"/>
       <w:numFmt w:val="decimal"/>
@@ -8795,9 +8755,9 @@
     </w:lvl>
   </w:abstractNum>
   <w:abstractNum w:abstractNumId="5" w15:restartNumberingAfterBreak="0">
-    <w:nsid w:val="59EB4C95"/>
+    <w:nsid w:val="6D872761"/>
     <w:multiLevelType w:val="multilevel"/>
-    <w:tmpl w:val="8A58CEDE"/>
+    <w:tmpl w:val="DEC23F58"/>
     <w:lvl w:ilvl="0">
       <w:start w:val="1"/>
       <w:numFmt w:val="decimal"/>
@@ -8908,9 +8868,9 @@
     </w:lvl>
   </w:abstractNum>
   <w:abstractNum w:abstractNumId="6" w15:restartNumberingAfterBreak="0">
-    <w:nsid w:val="76031104"/>
+    <w:nsid w:val="7F413F45"/>
     <w:multiLevelType w:val="multilevel"/>
-    <w:tmpl w:val="F4A881E8"/>
+    <w:tmpl w:val="03705394"/>
     <w:lvl w:ilvl="0">
       <w:start w:val="1"/>
       <w:numFmt w:val="decimal"/>
@@ -9020,25 +8980,25 @@
       </w:pPr>
     </w:lvl>
   </w:abstractNum>
-  <w:num w:numId="1" w16cid:durableId="290482880">
+  <w:num w:numId="1" w16cid:durableId="2053536819">
+    <w:abstractNumId w:val="2"/>
+  </w:num>
+  <w:num w:numId="2" w16cid:durableId="1767729518">
     <w:abstractNumId w:val="1"/>
   </w:num>
-  <w:num w:numId="2" w16cid:durableId="1760440616">
+  <w:num w:numId="3" w16cid:durableId="2006784464">
+    <w:abstractNumId w:val="6"/>
+  </w:num>
+  <w:num w:numId="4" w16cid:durableId="896817881">
     <w:abstractNumId w:val="0"/>
   </w:num>
-  <w:num w:numId="3" w16cid:durableId="399862396">
-    <w:abstractNumId w:val="6"/>
+  <w:num w:numId="5" w16cid:durableId="1252860118">
+    <w:abstractNumId w:val="5"/>
   </w:num>
-  <w:num w:numId="4" w16cid:durableId="18553532">
+  <w:num w:numId="6" w16cid:durableId="1783307657">
     <w:abstractNumId w:val="4"/>
   </w:num>
-  <w:num w:numId="5" w16cid:durableId="1332950367">
-    <w:abstractNumId w:val="5"/>
-  </w:num>
-  <w:num w:numId="6" w16cid:durableId="1872454757">
-    <w:abstractNumId w:val="2"/>
-  </w:num>
-  <w:num w:numId="7" w16cid:durableId="1678993934">
+  <w:num w:numId="7" w16cid:durableId="1541891702">
     <w:abstractNumId w:val="3"/>
   </w:num>
 </w:numbering>

</xml_diff>